<commit_message>
terminaciones a cosas existentes
</commit_message>
<xml_diff>
--- a/archivos_info/Plan de Desarrollo.docx
+++ b/archivos_info/Plan de Desarrollo.docx
@@ -33,42 +33,11 @@
         <w:spacing w:before="240" w:after="240"/>
       </w:pPr>
       <w:r>
-        <w:rPr>
-          <w:b/>
-          <w:bCs/>
-        </w:rPr>
-        <w:t>Versión:</w:t>
-      </w:r>
-      <w:r>
-        <w:t xml:space="preserve"> 4.0</w:t>
-      </w:r>
-      <w:r>
+        <w:t>Versión: 5.0</w:t>
         <w:br/>
-        <w:t xml:space="preserve"> </w:t>
-      </w:r>
-      <w:r>
-        <w:rPr>
-          <w:b/>
-          <w:bCs/>
-        </w:rPr>
-        <w:t>Fecha:</w:t>
-      </w:r>
-      <w:r>
-        <w:t xml:space="preserve"> Marzo 2026</w:t>
-      </w:r>
-      <w:r>
+        <w:t>Fecha: Octubre 2026</w:t>
         <w:br/>
-        <w:t xml:space="preserve"> </w:t>
-      </w:r>
-      <w:r>
-        <w:rPr>
-          <w:b/>
-          <w:bCs/>
-        </w:rPr>
-        <w:t>Estado:</w:t>
-      </w:r>
-      <w:r>
-        <w:t xml:space="preserve"> Activo</w:t>
+        <w:t>Estado: En desarrollo activo (Etapas 1 y 2 completadas)</w:t>
       </w:r>
     </w:p>
     <w:p>
@@ -298,7 +267,7 @@
         <w:spacing w:after="240"/>
       </w:pPr>
       <w:r>
-        <w:t>Gestión de garantías</w:t>
+        <w:t>Gestión de garantías y posventa: canalizada directamente mediante atención personalizada vía WhatsApp oficial</w:t>
       </w:r>
     </w:p>
     <w:p>
@@ -372,6 +341,8 @@
       </w:pPr>
       <w:r>
         <w:t>Integración con marketplaces (MercadoLibre, etc.)</w:t>
+        <w:br/>
+        <w:t>Sistema automatizado de emisión y consulta pública de garantías en la web (atención personalizada por WhatsApp)</w:t>
       </w:r>
     </w:p>
     <w:p>
@@ -2778,7 +2749,7 @@
         </w:numPr>
       </w:pPr>
       <w:r>
-        <w:t>Se redirige al checkout de MercadoPago (procesamiento externo y seguro)</w:t>
+        <w:t>Se procesa a través de la pasarela Mobbex Checkout Pro (o pasarela externa segura)</w:t>
       </w:r>
     </w:p>
     <w:p>
@@ -2789,14 +2760,7 @@
         </w:numPr>
       </w:pPr>
       <w:r>
-        <w:t xml:space="preserve">MercadoPago dispara webhook a </w:t>
-      </w:r>
-      <w:r>
-        <w:rPr>
-          <w:rFonts w:ascii="Roboto Mono" w:eastAsia="Roboto Mono" w:hAnsi="Roboto Mono" w:cs="Roboto Mono"/>
-          <w:color w:val="188038"/>
-        </w:rPr>
-        <w:t>/api/webhooks/mercadopago</w:t>
+        <w:t>Pasarela Mobbex dispara webhook a /api/webhooks/mobbex</w:t>
       </w:r>
     </w:p>
     <w:p>
@@ -2841,7 +2805,7 @@
         <w:spacing w:after="240"/>
       </w:pPr>
       <w:r>
-        <w:t>El dinero queda acreditado en la cuenta de MercadoPago de Ale para retirar a su CBU</w:t>
+        <w:t>El dinero queda acreditado en la cuenta de Mobbex de Ale. (Nota operativa: Tarjeta en proceso de habilitación comercial; Transferencia bancaria como método principal activo mientras tanto).</w:t>
       </w:r>
     </w:p>
     <w:p>
@@ -2913,7 +2877,7 @@
         </w:numPr>
       </w:pPr>
       <w:r>
-        <w:t>Cliente realiza la transferencia por su cuenta</w:t>
+        <w:t>Cliente realiza la transferencia por su cuenta. Podés comprar y transferir las 24 hs sin restricciones de horario; la verificación manual de Ale se realiza en horario comercial o en la próxima apertura del local al día hábil siguiente.</w:t>
       </w:r>
     </w:p>
     <w:p>
@@ -2936,7 +2900,7 @@
         <w:spacing w:after="240"/>
       </w:pPr>
       <w:r>
-        <w:t>La orden pasa a "Pagado" y se dispara el email de notificación</w:t>
+        <w:t>La orden pasa a "Pagado" y se dispara el email de notificación al cliente y a Ale. El stock permanece asegurado por 72 horas hábiles (excluyendo domingos).</w:t>
       </w:r>
     </w:p>
     <w:p>
@@ -7402,7 +7366,7 @@
         <w:spacing w:before="240"/>
       </w:pPr>
       <w:r>
-        <w:t>[ ] Reunión técnica con Ale: mapeo de tablas MySQL de GesCom</w:t>
+        <w:t>[x] Reunión técnica con Ale: mapeo de tablas MySQL de GesCom</w:t>
       </w:r>
     </w:p>
     <w:p>
@@ -7413,10 +7377,7 @@
         </w:numPr>
       </w:pPr>
       <w:r>
-        <w:rPr>
-          <w:rFonts w:ascii="Arial Unicode MS" w:eastAsia="Arial Unicode MS" w:hAnsi="Arial Unicode MS" w:cs="Arial Unicode MS"/>
-        </w:rPr>
-        <w:t>[ ] Confirmar campos disponibles: codigo_articulo → SKU, descripcion → gescom_name, precio → base_price, stock → stock, marca → brand</w:t>
+        <w:t>[x] Confirmar campos disponibles: codigo_articulo → SKU, descripcion → gescom_name, precio → base_price, stock → stock, marca → brand</w:t>
       </w:r>
     </w:p>
     <w:p>
@@ -7427,56 +7388,50 @@
         </w:numPr>
       </w:pPr>
       <w:r>
-        <w:t>[ ] Confirmar ruta exacta de la carpeta de imágenes (</w:t>
+        <w:t>[x] Confirmar ruta exacta de la carpeta de imágenes (Datos G\GESCOM\Imagenes)</w:t>
+      </w:r>
+    </w:p>
+    <w:p>
+      <w:pPr>
+        <w:numPr>
+          <w:ilvl w:val="0"/>
+          <w:numId w:val="37"/>
+        </w:numPr>
+      </w:pPr>
+      <w:r>
+        <w:t>[x] Verificar convención de nombres de imágenes (7 dígitos + _1, _2, etc.)</w:t>
+      </w:r>
+    </w:p>
+    <w:p>
+      <w:pPr>
+        <w:numPr>
+          <w:ilvl w:val="0"/>
+          <w:numId w:val="37"/>
+        </w:numPr>
+      </w:pPr>
+      <w:r>
+        <w:t>[x] Verificar si las tablas de GesCom tienen columna fecha_modificacion o last_updated_at</w:t>
+      </w:r>
+    </w:p>
+    <w:p>
+      <w:pPr>
+        <w:numPr>
+          <w:ilvl w:val="1"/>
+          <w:numId w:val="37"/>
+        </w:numPr>
+      </w:pPr>
+      <w:r>
+        <w:t xml:space="preserve">Si existe: el polling usará </w:t>
       </w:r>
       <w:r>
         <w:rPr>
           <w:rFonts w:ascii="Roboto Mono" w:eastAsia="Roboto Mono" w:hAnsi="Roboto Mono" w:cs="Roboto Mono"/>
           <w:color w:val="188038"/>
         </w:rPr>
-        <w:t>Datos G\GESCOM\Imagenes</w:t>
-      </w:r>
-      <w:r>
-        <w:t>)</w:t>
-      </w:r>
-    </w:p>
-    <w:p>
-      <w:pPr>
-        <w:numPr>
-          <w:ilvl w:val="0"/>
-          <w:numId w:val="37"/>
-        </w:numPr>
-      </w:pPr>
-      <w:r>
-        <w:t>[ ] Verificar convención de nombres de imágenes (7 dígitos + _1, _2, etc.)</w:t>
-      </w:r>
-    </w:p>
-    <w:p>
-      <w:pPr>
-        <w:numPr>
-          <w:ilvl w:val="0"/>
-          <w:numId w:val="37"/>
-        </w:numPr>
-      </w:pPr>
-      <w:r>
-        <w:t xml:space="preserve">[ ] Verificar si las tablas de GesCom tienen columna </w:t>
-      </w:r>
-      <w:r>
-        <w:rPr>
-          <w:rFonts w:ascii="Roboto Mono" w:eastAsia="Roboto Mono" w:hAnsi="Roboto Mono" w:cs="Roboto Mono"/>
-          <w:color w:val="188038"/>
-        </w:rPr>
-        <w:t>fecha_modificacion</w:t>
-      </w:r>
-      <w:r>
-        <w:t xml:space="preserve"> o </w:t>
-      </w:r>
-      <w:r>
-        <w:rPr>
-          <w:rFonts w:ascii="Roboto Mono" w:eastAsia="Roboto Mono" w:hAnsi="Roboto Mono" w:cs="Roboto Mono"/>
-          <w:color w:val="188038"/>
-        </w:rPr>
-        <w:t>last_updated_at</w:t>
+        <w:t>WHERE fecha_modificacion &gt;= ultima_sincronizacion</w:t>
+      </w:r>
+      <w:r>
+        <w:t xml:space="preserve"> (mucho más eficiente)</w:t>
       </w:r>
     </w:p>
     <w:p>
@@ -7487,28 +7442,18 @@
         </w:numPr>
       </w:pPr>
       <w:r>
-        <w:t xml:space="preserve">Si existe: el polling usará </w:t>
-      </w:r>
-      <w:r>
-        <w:rPr>
-          <w:rFonts w:ascii="Roboto Mono" w:eastAsia="Roboto Mono" w:hAnsi="Roboto Mono" w:cs="Roboto Mono"/>
-          <w:color w:val="188038"/>
-        </w:rPr>
-        <w:t>WHERE fecha_modificacion &gt;= ultima_sincronizacion</w:t>
-      </w:r>
-      <w:r>
-        <w:t xml:space="preserve"> (mucho más eficiente)</w:t>
-      </w:r>
-    </w:p>
-    <w:p>
-      <w:pPr>
-        <w:numPr>
-          <w:ilvl w:val="1"/>
+        <w:t>Si no existe: el polling traerá todos los registros y comparará por hash MD5</w:t>
+      </w:r>
+    </w:p>
+    <w:p>
+      <w:pPr>
+        <w:numPr>
+          <w:ilvl w:val="0"/>
           <w:numId w:val="37"/>
         </w:numPr>
       </w:pPr>
       <w:r>
-        <w:t>Si no existe: el polling traerá todos los registros y comparará por hash MD5</w:t>
+        <w:t>[x] Crear usuario MySQL gescom_reader con solo SELECT en las tablas necesarias</w:t>
       </w:r>
     </w:p>
     <w:p>
@@ -7519,17 +7464,7 @@
         </w:numPr>
       </w:pPr>
       <w:r>
-        <w:t xml:space="preserve">[ ] Crear usuario MySQL </w:t>
-      </w:r>
-      <w:r>
-        <w:rPr>
-          <w:rFonts w:ascii="Roboto Mono" w:eastAsia="Roboto Mono" w:hAnsi="Roboto Mono" w:cs="Roboto Mono"/>
-          <w:color w:val="188038"/>
-        </w:rPr>
-        <w:t>gescom_reader</w:t>
-      </w:r>
-      <w:r>
-        <w:t xml:space="preserve"> con solo SELECT en las tablas necesarias</w:t>
+        <w:t>[x] Setup del repositorio en GitHub</w:t>
       </w:r>
     </w:p>
     <w:p>
@@ -7540,7 +7475,7 @@
         </w:numPr>
       </w:pPr>
       <w:r>
-        <w:t>[ ] Setup del repositorio en GitHub</w:t>
+        <w:t>[x] Configurar ESLint + Prettier + TypeScript</w:t>
       </w:r>
     </w:p>
     <w:p>
@@ -7551,7 +7486,7 @@
         </w:numPr>
       </w:pPr>
       <w:r>
-        <w:t>[ ] Configurar ESLint + Prettier + TypeScript</w:t>
+        <w:t>[x] Setup de base de datos en Railway (staging)</w:t>
       </w:r>
     </w:p>
     <w:p>
@@ -7562,7 +7497,7 @@
         </w:numPr>
       </w:pPr>
       <w:r>
-        <w:t>[ ] Setup de base de datos en Railway (staging)</w:t>
+        <w:t>[x] Correr migraciones de Prisma con el esquema base (incluye tabla brands)</w:t>
       </w:r>
     </w:p>
     <w:p>
@@ -7573,7 +7508,7 @@
         </w:numPr>
       </w:pPr>
       <w:r>
-        <w:t>[ ] Correr migraciones de Prisma con el esquema base (incluye tabla brands)</w:t>
+        <w:t>[x] Configurar dominio papesconfort.com en Cloudflare</w:t>
       </w:r>
     </w:p>
     <w:p>
@@ -7582,21 +7517,10 @@
           <w:ilvl w:val="0"/>
           <w:numId w:val="37"/>
         </w:numPr>
-      </w:pPr>
-      <w:r>
-        <w:t>[ ] Configurar dominio papesconfort.com en Cloudflare</w:t>
-      </w:r>
-    </w:p>
-    <w:p>
-      <w:pPr>
-        <w:numPr>
-          <w:ilvl w:val="0"/>
-          <w:numId w:val="37"/>
-        </w:numPr>
         <w:spacing w:after="240"/>
       </w:pPr>
       <w:r>
-        <w:t>[ ] Configurar Cloudflare Images o R2 para almacenamiento de imágenes</w:t>
+        <w:t>[x] Configurar Cloudflare Images o R2 para almacenamiento de imágenes</w:t>
       </w:r>
     </w:p>
     <w:p>
@@ -8720,7 +8644,7 @@
         <w:spacing w:before="240"/>
       </w:pPr>
       <w:r>
-        <w:t>[ ] Setup del proyecto Node.js + TypeScript</w:t>
+        <w:t>[x] Setup del proyecto Node.js + TypeScript</w:t>
       </w:r>
     </w:p>
     <w:p>
@@ -8731,24 +8655,7 @@
         </w:numPr>
       </w:pPr>
       <w:r>
-        <w:t xml:space="preserve">[ ] Conexión a MySQL de GesCom con </w:t>
-      </w:r>
-      <w:r>
-        <w:rPr>
-          <w:rFonts w:ascii="Roboto Mono" w:eastAsia="Roboto Mono" w:hAnsi="Roboto Mono" w:cs="Roboto Mono"/>
-          <w:color w:val="188038"/>
-        </w:rPr>
-        <w:t>mysql2</w:t>
-      </w:r>
-      <w:r>
-        <w:t xml:space="preserve"> y usuario </w:t>
-      </w:r>
-      <w:r>
-        <w:rPr>
-          <w:rFonts w:ascii="Roboto Mono" w:eastAsia="Roboto Mono" w:hAnsi="Roboto Mono" w:cs="Roboto Mono"/>
-          <w:color w:val="188038"/>
-        </w:rPr>
-        <w:t>gescom_reader</w:t>
+        <w:t>[x] Conexión a MySQL de GesCom con mysql2 y usuario gescom_reader</w:t>
       </w:r>
     </w:p>
     <w:p>
@@ -8759,7 +8666,7 @@
         </w:numPr>
       </w:pPr>
       <w:r>
-        <w:t>[ ] Módulo de hash MD5 para registros y archivos</w:t>
+        <w:t>[x] Módulo de hash MD5 para registros y archivos</w:t>
       </w:r>
     </w:p>
     <w:p>
@@ -8770,7 +8677,7 @@
         </w:numPr>
       </w:pPr>
       <w:r>
-        <w:t>[ ] Ciclo de sync de datos: lectura, comparación, payload, POST a la API</w:t>
+        <w:t>[x] Ciclo de sync de datos: lectura, comparación, payload, POST a la API</w:t>
       </w:r>
     </w:p>
     <w:p>
@@ -8781,7 +8688,7 @@
         </w:numPr>
       </w:pPr>
       <w:r>
-        <w:t>[ ] Lógica de stock de seguridad en el ciclo de sync</w:t>
+        <w:t>[x] Lógica de stock de seguridad en el ciclo de sync</w:t>
       </w:r>
     </w:p>
     <w:p>
@@ -8792,7 +8699,7 @@
         </w:numPr>
       </w:pPr>
       <w:r>
-        <w:t>[ ] Ciclo de sync de imágenes: lectura de carpeta, detección de cambios, subida</w:t>
+        <w:t>[x] Ciclo de sync de imágenes: lectura de carpeta, detección de cambios, subida</w:t>
       </w:r>
     </w:p>
     <w:p>
@@ -8803,7 +8710,7 @@
         </w:numPr>
       </w:pPr>
       <w:r>
-        <w:t>[ ] Manejo de marcas dentro del ciclo de datos</w:t>
+        <w:t>[x] Manejo de marcas dentro del ciclo de datos</w:t>
       </w:r>
     </w:p>
     <w:p>
@@ -8814,17 +8721,7 @@
         </w:numPr>
       </w:pPr>
       <w:r>
-        <w:t xml:space="preserve">[ ] Endpoint en la API: </w:t>
-      </w:r>
-      <w:r>
-        <w:rPr>
-          <w:rFonts w:ascii="Roboto Mono" w:eastAsia="Roboto Mono" w:hAnsi="Roboto Mono" w:cs="Roboto Mono"/>
-          <w:color w:val="188038"/>
-        </w:rPr>
-        <w:t>POST /api/sync/products</w:t>
-      </w:r>
-      <w:r>
-        <w:t xml:space="preserve"> con validación Zod</w:t>
+        <w:t>[x] Endpoint en la API: POST /api/sync/products con validación Zod</w:t>
       </w:r>
     </w:p>
     <w:p>
@@ -8835,17 +8732,7 @@
         </w:numPr>
       </w:pPr>
       <w:r>
-        <w:t xml:space="preserve">[ ] Endpoint en la API: </w:t>
-      </w:r>
-      <w:r>
-        <w:rPr>
-          <w:rFonts w:ascii="Roboto Mono" w:eastAsia="Roboto Mono" w:hAnsi="Roboto Mono" w:cs="Roboto Mono"/>
-          <w:color w:val="188038"/>
-        </w:rPr>
-        <w:t>POST /api/sync/images</w:t>
-      </w:r>
-      <w:r>
-        <w:t xml:space="preserve"> con subida a Cloudflare</w:t>
+        <w:t>[x] Endpoint en la API: POST /api/sync/images con subida a Cloudflare</w:t>
       </w:r>
     </w:p>
     <w:p>
@@ -8856,7 +8743,7 @@
         </w:numPr>
       </w:pPr>
       <w:r>
-        <w:t>[ ] Lógica upsert de productos y marcas en Prisma</w:t>
+        <w:t>[x] Lógica upsert de productos y marcas en Prisma</w:t>
       </w:r>
     </w:p>
     <w:p>
@@ -8867,7 +8754,7 @@
         </w:numPr>
       </w:pPr>
       <w:r>
-        <w:t>[ ] node-cron: job de datos cada 1 minuto</w:t>
+        <w:t>[x] node-cron: job de datos cada 1 minuto</w:t>
       </w:r>
     </w:p>
     <w:p>
@@ -8878,7 +8765,7 @@
         </w:numPr>
       </w:pPr>
       <w:r>
-        <w:t>[ ] chokidar: watcher de imágenes en tiempo real (reemplaza el cron de imágenes)</w:t>
+        <w:t>[x] chokidar: watcher de imágenes en tiempo real (reemplaza el cron de imágenes)</w:t>
       </w:r>
     </w:p>
     <w:p>
@@ -8889,7 +8776,7 @@
         </w:numPr>
       </w:pPr>
       <w:r>
-        <w:t>[ ] Manejo de errores con reintentos y backoff exponencial</w:t>
+        <w:t>[x] Manejo de errores con reintentos y backoff exponencial</w:t>
       </w:r>
     </w:p>
     <w:p>
@@ -8900,17 +8787,7 @@
         </w:numPr>
       </w:pPr>
       <w:r>
-        <w:t xml:space="preserve">[ ] Logging en tabla </w:t>
-      </w:r>
-      <w:r>
-        <w:rPr>
-          <w:rFonts w:ascii="Roboto Mono" w:eastAsia="Roboto Mono" w:hAnsi="Roboto Mono" w:cs="Roboto Mono"/>
-          <w:color w:val="188038"/>
-        </w:rPr>
-        <w:t>sync_logs</w:t>
-      </w:r>
-      <w:r>
-        <w:t xml:space="preserve"> con detalle de productos, imágenes y marcas</w:t>
+        <w:t>[x] Logging en tabla sync_logs con detalle de productos, imágenes y marcas</w:t>
       </w:r>
     </w:p>
     <w:p>
@@ -8921,14 +8798,7 @@
         </w:numPr>
       </w:pPr>
       <w:r>
-        <w:t xml:space="preserve">[ ] Archivo de estado local </w:t>
-      </w:r>
-      <w:r>
-        <w:rPr>
-          <w:rFonts w:ascii="Roboto Mono" w:eastAsia="Roboto Mono" w:hAnsi="Roboto Mono" w:cs="Roboto Mono"/>
-          <w:color w:val="188038"/>
-        </w:rPr>
-        <w:t>sync-state.json</w:t>
+        <w:t>[x] Archivo de estado local sync-state.json</w:t>
       </w:r>
     </w:p>
     <w:p>
@@ -8940,17 +8810,7 @@
         <w:spacing w:after="240"/>
       </w:pPr>
       <w:r>
-        <w:t>[ ] Script de instalación para que Ale pueda correrlo fácilmente (</w:t>
-      </w:r>
-      <w:r>
-        <w:rPr>
-          <w:rFonts w:ascii="Roboto Mono" w:eastAsia="Roboto Mono" w:hAnsi="Roboto Mono" w:cs="Roboto Mono"/>
-          <w:color w:val="188038"/>
-        </w:rPr>
-        <w:t>npm start</w:t>
-      </w:r>
-      <w:r>
-        <w:t>)</w:t>
+        <w:t>[x] Script de instalación para que Ale pueda correrlo fácilmente (npm start)</w:t>
       </w:r>
     </w:p>
     <w:p>
@@ -8989,17 +8849,7 @@
         <w:spacing w:before="240"/>
       </w:pPr>
       <w:r>
-        <w:t xml:space="preserve">[ ] API REST: </w:t>
-      </w:r>
-      <w:r>
-        <w:rPr>
-          <w:rFonts w:ascii="Roboto Mono" w:eastAsia="Roboto Mono" w:hAnsi="Roboto Mono" w:cs="Roboto Mono"/>
-          <w:color w:val="188038"/>
-        </w:rPr>
-        <w:t>GET /api/products</w:t>
-      </w:r>
-      <w:r>
-        <w:t xml:space="preserve"> con paginación, filtros por categoría, marca y tipo</w:t>
+        <w:t>[x] API REST: GET /api/products con paginación, filtros por categoría, marca y tipo</w:t>
       </w:r>
     </w:p>
     <w:p>
@@ -9013,24 +8863,7 @@
         </w:rPr>
       </w:pPr>
       <w:r>
-        <w:rPr>
-          <w:lang w:val="en-US"/>
-        </w:rPr>
-        <w:t xml:space="preserve">[ ] API REST: </w:t>
-      </w:r>
-      <w:r>
-        <w:rPr>
-          <w:rFonts w:ascii="Roboto Mono" w:eastAsia="Roboto Mono" w:hAnsi="Roboto Mono" w:cs="Roboto Mono"/>
-          <w:color w:val="188038"/>
-          <w:lang w:val="en-US"/>
-        </w:rPr>
-        <w:t>GET /api/products/:slug</w:t>
-      </w:r>
-      <w:r>
-        <w:rPr>
-          <w:lang w:val="en-US"/>
-        </w:rPr>
-        <w:t xml:space="preserve"> detalle de producto</w:t>
+        <w:t>[x] API REST: GET /api/products/:slug detalle de producto</w:t>
       </w:r>
     </w:p>
     <w:p>
@@ -9041,17 +8874,7 @@
         </w:numPr>
       </w:pPr>
       <w:r>
-        <w:t xml:space="preserve">[ ] </w:t>
-      </w:r>
-      <w:r>
-        <w:rPr>
-          <w:rFonts w:ascii="Roboto Mono" w:eastAsia="Roboto Mono" w:hAnsi="Roboto Mono" w:cs="Roboto Mono"/>
-          <w:color w:val="188038"/>
-        </w:rPr>
-        <w:t>GET /api/categories</w:t>
-      </w:r>
-      <w:r>
-        <w:t xml:space="preserve"> con estructura Tipo &gt; Categoría</w:t>
+        <w:t>[x] GET /api/categories con estructura Tipo &gt; Categoría</w:t>
       </w:r>
     </w:p>
     <w:p>
@@ -9062,17 +8885,7 @@
         </w:numPr>
       </w:pPr>
       <w:r>
-        <w:t xml:space="preserve">[ ] </w:t>
-      </w:r>
-      <w:r>
-        <w:rPr>
-          <w:rFonts w:ascii="Roboto Mono" w:eastAsia="Roboto Mono" w:hAnsi="Roboto Mono" w:cs="Roboto Mono"/>
-          <w:color w:val="188038"/>
-        </w:rPr>
-        <w:t>GET /api/brands</w:t>
-      </w:r>
-      <w:r>
-        <w:t xml:space="preserve"> listado de marcas disponibles</w:t>
+        <w:t>[x] GET /api/brands listado de marcas disponibles</w:t>
       </w:r>
     </w:p>
     <w:p>
@@ -9083,7 +8896,7 @@
         </w:numPr>
       </w:pPr>
       <w:r>
-        <w:t>[ ] Frontend: listado de productos con filtros laterales (categoría, marca, tipo)</w:t>
+        <w:t>[x] Frontend: listado de productos con filtros laterales (categoría, marca, tipo)</w:t>
       </w:r>
     </w:p>
     <w:p>
@@ -9094,7 +8907,7 @@
         </w:numPr>
       </w:pPr>
       <w:r>
-        <w:t>[ ] Frontend: página de detalle de producto con galería de imágenes</w:t>
+        <w:t>[x] Frontend: página de detalle de producto con galería de imágenes</w:t>
       </w:r>
     </w:p>
     <w:p>
@@ -9105,7 +8918,7 @@
         </w:numPr>
       </w:pPr>
       <w:r>
-        <w:t>[ ] Frontend: navegación por categorías y marcas</w:t>
+        <w:t>[x] Frontend: navegación por categorías y marcas</w:t>
       </w:r>
     </w:p>
     <w:p>
@@ -9116,7 +8929,7 @@
         </w:numPr>
       </w:pPr>
       <w:r>
-        <w:t>[ ] Panel admin: listado de productos sincronizados con columnas gescom_name, precio, stock, marca</w:t>
+        <w:t>[x] Panel admin: listado de productos sincronizados con columnas gescom_name, precio, stock, marca</w:t>
       </w:r>
     </w:p>
     <w:p>
@@ -9127,7 +8940,7 @@
         </w:numPr>
       </w:pPr>
       <w:r>
-        <w:t>[ ] Panel admin: formulario de enriquecimiento de producto:</w:t>
+        <w:t>[x] Panel admin: formulario de enriquecimiento de producto:</w:t>
       </w:r>
     </w:p>
     <w:p>
@@ -9205,7 +9018,7 @@
         </w:numPr>
       </w:pPr>
       <w:r>
-        <w:t>[ ] Panel admin: log de sincronización con detalle de productos, imágenes y marcas procesadas</w:t>
+        <w:t>[x] Panel admin: log de sincronización con detalle de productos, imágenes y marcas procesadas</w:t>
       </w:r>
     </w:p>
     <w:p>
@@ -9216,7 +9029,7 @@
         </w:numPr>
       </w:pPr>
       <w:r>
-        <w:t>[ ] Panel admin: configuración de stock de seguridad (valor numérico global, por defecto 1)</w:t>
+        <w:t>[x] Panel admin: configuración de stock de seguridad (valor numérico global, por defecto 1)</w:t>
       </w:r>
     </w:p>
     <w:p>
@@ -9227,7 +9040,7 @@
         </w:numPr>
       </w:pPr>
       <w:r>
-        <w:t>[ ] Autenticación JWT: login, refresh token, logout</w:t>
+        <w:t>[x] Autenticación JWT: login, refresh token, logout</w:t>
       </w:r>
     </w:p>
     <w:p>
@@ -9238,7 +9051,7 @@
         </w:numPr>
       </w:pPr>
       <w:r>
-        <w:t>[ ] Deploy en staging</w:t>
+        <w:t>[x] Deploy en staging</w:t>
       </w:r>
     </w:p>
     <w:p>
@@ -9250,7 +9063,7 @@
         <w:spacing w:after="240"/>
       </w:pPr>
       <w:r>
-        <w:t>[ ] Demo al cliente</w:t>
+        <w:t>[x] Demo al cliente</w:t>
       </w:r>
     </w:p>
     <w:p>
@@ -9353,7 +9166,7 @@
         <w:spacing w:before="240"/>
       </w:pPr>
       <w:r>
-        <w:t>[ ] Zustand store del carrito con persistencia en localStorage + Redis</w:t>
+        <w:t>[x] Zustand store del carrito con persistencia en localStorage + Redis</w:t>
       </w:r>
     </w:p>
     <w:p>
@@ -9364,7 +9177,7 @@
         </w:numPr>
       </w:pPr>
       <w:r>
-        <w:t>[ ] API: CRUD de items del carrito</w:t>
+        <w:t>[x] API: CRUD de items del carrito</w:t>
       </w:r>
     </w:p>
     <w:p>
@@ -9375,7 +9188,7 @@
         </w:numPr>
       </w:pPr>
       <w:r>
-        <w:t>[ ] Validación de stock real al agregar</w:t>
+        <w:t>[x] Validación de stock real al agregar</w:t>
       </w:r>
     </w:p>
     <w:p>
@@ -9386,7 +9199,7 @@
         </w:numPr>
       </w:pPr>
       <w:r>
-        <w:t>[ ] Sesión de carrito por cookie que sobrevive al cierre de pestaña</w:t>
+        <w:t>[x] Sesión de carrito por cookie que sobrevive al cierre de pestaña</w:t>
       </w:r>
     </w:p>
     <w:p>
@@ -9397,7 +9210,7 @@
         </w:numPr>
       </w:pPr>
       <w:r>
-        <w:t>[ ] Cálculo de subtotal con descuentos según tipo de producto</w:t>
+        <w:t>[x] Cálculo de subtotal con descuentos según tipo de producto</w:t>
       </w:r>
     </w:p>
     <w:p>
@@ -9409,7 +9222,7 @@
         <w:spacing w:after="240"/>
       </w:pPr>
       <w:r>
-        <w:t>[ ] Frontend: componente carrito + badge en header</w:t>
+        <w:t>[x] Frontend: componente carrito + badge en header</w:t>
       </w:r>
     </w:p>
     <w:p>
@@ -9448,7 +9261,7 @@
         <w:spacing w:before="240"/>
       </w:pPr>
       <w:r>
-        <w:t>[ ] Panel admin: ABM de cuentas bancarias (alias, CBU, banco, titular)</w:t>
+        <w:t>[x] Panel admin: ABM de cuentas bancarias (alias, CBU, banco, titular)</w:t>
       </w:r>
     </w:p>
     <w:p>
@@ -9459,7 +9272,7 @@
         </w:numPr>
       </w:pPr>
       <w:r>
-        <w:t>[ ] Lógica de cuenta activa: solo una puede estar activa a la vez</w:t>
+        <w:t>[x] Lógica de cuenta activa: solo una puede estar activa a la vez</w:t>
       </w:r>
     </w:p>
     <w:p>
@@ -9470,7 +9283,7 @@
         </w:numPr>
       </w:pPr>
       <w:r>
-        <w:t>[ ] Al activar una cuenta, se desactiva automáticamente la anterior</w:t>
+        <w:t>[x] Al activar una cuenta, se desactiva automáticamente la anterior</w:t>
       </w:r>
     </w:p>
     <w:p>
@@ -9484,24 +9297,7 @@
         </w:rPr>
       </w:pPr>
       <w:r>
-        <w:rPr>
-          <w:lang w:val="en-US"/>
-        </w:rPr>
-        <w:t xml:space="preserve">[ ] Endpoint: </w:t>
-      </w:r>
-      <w:r>
-        <w:rPr>
-          <w:rFonts w:ascii="Roboto Mono" w:eastAsia="Roboto Mono" w:hAnsi="Roboto Mono" w:cs="Roboto Mono"/>
-          <w:color w:val="188038"/>
-          <w:lang w:val="en-US"/>
-        </w:rPr>
-        <w:t>GET /api/bank-accounts/active</w:t>
-      </w:r>
-      <w:r>
-        <w:rPr>
-          <w:lang w:val="en-US"/>
-        </w:rPr>
-        <w:t xml:space="preserve"> para el checkout</w:t>
+        <w:t>[x] Endpoint: GET /api/bank-accounts/active para el checkout</w:t>
       </w:r>
     </w:p>
     <w:p>
@@ -9512,7 +9308,7 @@
         </w:numPr>
       </w:pPr>
       <w:r>
-        <w:t>[ ] Frontend checkout: mostrar CBU/alias de la cuenta activa cuando el cliente elige transferencia</w:t>
+        <w:t>[x] Frontend checkout: mostrar CBU/alias de la cuenta activa cuando el cliente elige transferencia</w:t>
       </w:r>
     </w:p>
     <w:p>
@@ -9523,14 +9319,7 @@
         </w:numPr>
       </w:pPr>
       <w:r>
-        <w:t xml:space="preserve">[ ] Creación de orden en estado </w:t>
-      </w:r>
-      <w:r>
-        <w:rPr>
-          <w:rFonts w:ascii="Roboto Mono" w:eastAsia="Roboto Mono" w:hAnsi="Roboto Mono" w:cs="Roboto Mono"/>
-          <w:color w:val="188038"/>
-        </w:rPr>
-        <w:t>pending_confirmation</w:t>
+        <w:t>[x] Creación de orden en estado pending_confirmation</w:t>
       </w:r>
     </w:p>
     <w:p>
@@ -9541,7 +9330,7 @@
         </w:numPr>
       </w:pPr>
       <w:r>
-        <w:t>[ ] Email a Ale avisando que hay una transferencia pendiente de confirmar</w:t>
+        <w:t>[x] Email a Ale avisando que hay una transferencia pendiente de confirmar</w:t>
       </w:r>
     </w:p>
     <w:p>
@@ -9552,7 +9341,7 @@
         </w:numPr>
       </w:pPr>
       <w:r>
-        <w:t>[ ] Panel admin: botón "Confirmar transferencia recibida" en el detalle de la orden</w:t>
+        <w:t>[x] Panel admin: botón "Confirmar transferencia recibida" en el detalle de la orden</w:t>
       </w:r>
     </w:p>
     <w:p>
@@ -9563,17 +9352,7 @@
         </w:numPr>
       </w:pPr>
       <w:r>
-        <w:t xml:space="preserve">[ ] Al confirmar: orden pasa a </w:t>
-      </w:r>
-      <w:r>
-        <w:rPr>
-          <w:rFonts w:ascii="Roboto Mono" w:eastAsia="Roboto Mono" w:hAnsi="Roboto Mono" w:cs="Roboto Mono"/>
-          <w:color w:val="188038"/>
-        </w:rPr>
-        <w:t>paid</w:t>
-      </w:r>
-      <w:r>
-        <w:t>, se registra quién confirmó y cuándo</w:t>
+        <w:t>[x] Al confirmar: orden pasa a paid, se registra quién confirmó y cuándo</w:t>
       </w:r>
     </w:p>
     <w:p>
@@ -9585,7 +9364,11 @@
         <w:spacing w:after="240"/>
       </w:pPr>
       <w:r>
-        <w:t>[ ] Email al cliente confirmando que su pago fue recibido</w:t>
+        <w:t>[x] Email al cliente confirmando que su pago fue recibido</w:t>
+        <w:br/>
+        <w:t>[x] Regla de Transferencias 24 hs: El cliente puede comprar y transferir en cualquier momento (las 24 hs sin bloqueo). Se aclara que la verificación manual de Ale se realiza en horario comercial o al día hábil siguiente al abrir el local.</w:t>
+        <w:br/>
+        <w:t>[x] Reserva de stock para transferencias: Garantizada por 72 horas hábiles (excluyendo domingos).</w:t>
       </w:r>
     </w:p>
     <w:p>
@@ -9624,7 +9407,7 @@
         <w:spacing w:before="240"/>
       </w:pPr>
       <w:r>
-        <w:t>[ ] Integración MercadoPago Checkout Pro</w:t>
+        <w:t>[x] Integración de pasarela de pago Mobbex (Checkout Pro y Webhooks /api/webhooks/mobbex)</w:t>
       </w:r>
     </w:p>
     <w:p>
@@ -9635,7 +9418,7 @@
         </w:numPr>
       </w:pPr>
       <w:r>
-        <w:t>[ ] Al iniciar checkout con tarjeta:</w:t>
+        <w:t>[x] Al iniciar checkout con tarjeta:</w:t>
       </w:r>
     </w:p>
     <w:p>
@@ -9718,7 +9501,7 @@
         </w:numPr>
       </w:pPr>
       <w:r>
-        <w:t>[ ] Cron job de liberación de stock (cada 2 minutos):</w:t>
+        <w:t>[x] Cron job de liberación de stock (orderExpiry.job.ts cada 5 minutos restaurando stock reservado)</w:t>
       </w:r>
     </w:p>
     <w:p>
@@ -9797,7 +9580,7 @@
         </w:numPr>
       </w:pPr>
       <w:r>
-        <w:t>[ ] Manejar callback de retorno de MP (aprobado / rechazado / pendiente)</w:t>
+        <w:t>[x] Manejar callback de retorno de pasarela en /pedido/resultado (aprobado / rechazado / pendiente)</w:t>
       </w:r>
     </w:p>
     <w:p>
@@ -9811,24 +9594,39 @@
         </w:rPr>
       </w:pPr>
       <w:r>
-        <w:rPr>
-          <w:lang w:val="en-US"/>
-        </w:rPr>
-        <w:t xml:space="preserve">[ ] Webhook </w:t>
+        <w:t>[x] Webhook POST /api/webhooks/mobbex con verificación de firma e idempotencia</w:t>
+      </w:r>
+    </w:p>
+    <w:p>
+      <w:pPr>
+        <w:numPr>
+          <w:ilvl w:val="1"/>
+          <w:numId w:val="22"/>
+        </w:numPr>
+      </w:pPr>
+      <w:r>
+        <w:t>Verificación de firma HMAC-SHA256</w:t>
+      </w:r>
+    </w:p>
+    <w:p>
+      <w:pPr>
+        <w:numPr>
+          <w:ilvl w:val="1"/>
+          <w:numId w:val="22"/>
+        </w:numPr>
+      </w:pPr>
+      <w:r>
+        <w:t xml:space="preserve">Idempotencia garantizada por constraint UNIQUE en </w:t>
       </w:r>
       <w:r>
         <w:rPr>
           <w:rFonts w:ascii="Roboto Mono" w:eastAsia="Roboto Mono" w:hAnsi="Roboto Mono" w:cs="Roboto Mono"/>
           <w:color w:val="188038"/>
-          <w:lang w:val="en-US"/>
-        </w:rPr>
-        <w:t>POST /api/webhooks/mercadopago</w:t>
-      </w:r>
-      <w:r>
-        <w:rPr>
-          <w:lang w:val="en-US"/>
-        </w:rPr>
-        <w:t>:</w:t>
+        </w:rPr>
+        <w:t>mercadopago_payment_id</w:t>
+      </w:r>
+      <w:r>
+        <w:t xml:space="preserve"> (si el webhook retenta y el payment_id ya existe, Postgres rechaza el insert)</w:t>
       </w:r>
     </w:p>
     <w:p>
@@ -9839,7 +9637,14 @@
         </w:numPr>
       </w:pPr>
       <w:r>
-        <w:t>Verificación de firma HMAC-SHA256</w:t>
+        <w:t xml:space="preserve">Cambio de estado a </w:t>
+      </w:r>
+      <w:r>
+        <w:rPr>
+          <w:rFonts w:ascii="Roboto Mono" w:eastAsia="Roboto Mono" w:hAnsi="Roboto Mono" w:cs="Roboto Mono"/>
+          <w:color w:val="188038"/>
+        </w:rPr>
+        <w:t>paid</w:t>
       </w:r>
     </w:p>
     <w:p>
@@ -9850,17 +9655,50 @@
         </w:numPr>
       </w:pPr>
       <w:r>
-        <w:t xml:space="preserve">Idempotencia garantizada por constraint UNIQUE en </w:t>
+        <w:t>Confirmar el stock (la reserva se vuelve definitiva)</w:t>
+      </w:r>
+    </w:p>
+    <w:p>
+      <w:pPr>
+        <w:numPr>
+          <w:ilvl w:val="1"/>
+          <w:numId w:val="22"/>
+        </w:numPr>
+      </w:pPr>
+      <w:r>
+        <w:t>Encolar email de notificación a Ale en BullMQ (no bloqueante)</w:t>
+      </w:r>
+    </w:p>
+    <w:p>
+      <w:pPr>
+        <w:numPr>
+          <w:ilvl w:val="0"/>
+          <w:numId w:val="22"/>
+        </w:numPr>
+      </w:pPr>
+      <w:r>
+        <w:t>[x] Servicio de emails transaccionales para notificaciones al cliente y a Ale con Nodemailer/Resend</w:t>
+      </w:r>
+    </w:p>
+    <w:p>
+      <w:pPr>
+        <w:numPr>
+          <w:ilvl w:val="1"/>
+          <w:numId w:val="22"/>
+        </w:numPr>
+      </w:pPr>
+      <w:r>
+        <w:t xml:space="preserve">Queue </w:t>
       </w:r>
       <w:r>
         <w:rPr>
           <w:rFonts w:ascii="Roboto Mono" w:eastAsia="Roboto Mono" w:hAnsi="Roboto Mono" w:cs="Roboto Mono"/>
           <w:color w:val="188038"/>
         </w:rPr>
-        <w:t>mercadopago_payment_id</w:t>
-      </w:r>
-      <w:r>
-        <w:t xml:space="preserve"> (si el webhook retenta y el payment_id ya existe, Postgres rechaza el insert)</w:t>
+        <w:t>emails</w:t>
+      </w:r>
+      <w:r>
+        <w:t>: envío de emails a Ale y al cliente</w:t>
       </w:r>
     </w:p>
     <w:p>
@@ -9871,14 +9709,17 @@
         </w:numPr>
       </w:pPr>
       <w:r>
-        <w:t xml:space="preserve">Cambio de estado a </w:t>
+        <w:t xml:space="preserve">Queue </w:t>
       </w:r>
       <w:r>
         <w:rPr>
           <w:rFonts w:ascii="Roboto Mono" w:eastAsia="Roboto Mono" w:hAnsi="Roboto Mono" w:cs="Roboto Mono"/>
           <w:color w:val="188038"/>
         </w:rPr>
-        <w:t>paid</w:t>
+        <w:t>notifications</w:t>
+      </w:r>
+      <w:r>
+        <w:t>: futuras notificaciones (WhatsApp en v1.2)</w:t>
       </w:r>
     </w:p>
     <w:p>
@@ -9889,93 +9730,20 @@
         </w:numPr>
       </w:pPr>
       <w:r>
-        <w:t>Confirmar el stock (la reserva se vuelve definitiva)</w:t>
-      </w:r>
-    </w:p>
-    <w:p>
-      <w:pPr>
-        <w:numPr>
-          <w:ilvl w:val="1"/>
+        <w:t>Worker de emails con Nodemailer (falla sin afectar el response HTTP)</w:t>
+      </w:r>
+    </w:p>
+    <w:p>
+      <w:pPr>
+        <w:numPr>
+          <w:ilvl w:val="0"/>
           <w:numId w:val="22"/>
         </w:numPr>
       </w:pPr>
       <w:r>
-        <w:t>Encolar email de notificación a Ale en BullMQ (no bloqueante)</w:t>
-      </w:r>
-    </w:p>
-    <w:p>
-      <w:pPr>
-        <w:numPr>
-          <w:ilvl w:val="0"/>
-          <w:numId w:val="22"/>
-        </w:numPr>
-      </w:pPr>
-      <w:r>
-        <w:t>[ ] Setup de BullMQ con Redis para procesamiento en background:</w:t>
-      </w:r>
-    </w:p>
-    <w:p>
-      <w:pPr>
-        <w:numPr>
-          <w:ilvl w:val="1"/>
-          <w:numId w:val="22"/>
-        </w:numPr>
-      </w:pPr>
-      <w:r>
-        <w:t xml:space="preserve">Queue </w:t>
-      </w:r>
-      <w:r>
-        <w:rPr>
-          <w:rFonts w:ascii="Roboto Mono" w:eastAsia="Roboto Mono" w:hAnsi="Roboto Mono" w:cs="Roboto Mono"/>
-          <w:color w:val="188038"/>
-        </w:rPr>
-        <w:t>emails</w:t>
-      </w:r>
-      <w:r>
-        <w:t>: envío de emails a Ale y al cliente</w:t>
-      </w:r>
-    </w:p>
-    <w:p>
-      <w:pPr>
-        <w:numPr>
-          <w:ilvl w:val="1"/>
-          <w:numId w:val="22"/>
-        </w:numPr>
-      </w:pPr>
-      <w:r>
-        <w:t xml:space="preserve">Queue </w:t>
-      </w:r>
-      <w:r>
-        <w:rPr>
-          <w:rFonts w:ascii="Roboto Mono" w:eastAsia="Roboto Mono" w:hAnsi="Roboto Mono" w:cs="Roboto Mono"/>
-          <w:color w:val="188038"/>
-        </w:rPr>
-        <w:t>notifications</w:t>
-      </w:r>
-      <w:r>
-        <w:t>: futuras notificaciones (WhatsApp en v1.2)</w:t>
-      </w:r>
-    </w:p>
-    <w:p>
-      <w:pPr>
-        <w:numPr>
-          <w:ilvl w:val="1"/>
-          <w:numId w:val="22"/>
-        </w:numPr>
-      </w:pPr>
-      <w:r>
-        <w:t>Worker de emails con Nodemailer (falla sin afectar el response HTTP)</w:t>
-      </w:r>
-    </w:p>
-    <w:p>
-      <w:pPr>
-        <w:numPr>
-          <w:ilvl w:val="0"/>
-          <w:numId w:val="22"/>
-        </w:numPr>
-      </w:pPr>
-      <w:r>
-        <w:t>[ ] Reglas de métodos de pago según tipo de producto:</w:t>
+        <w:t>[x] Reglas de métodos de pago según tipo de producto (Outlet solo transferencia, Normal todos los métodos)</w:t>
+        <w:br/>
+        <w:t>[x] Estado operativo de tarjeta: En proceso de habilitación comercial de credenciales Mobbex (Transferencia bancaria activa como método principal mientras tanto)</w:t>
       </w:r>
     </w:p>
     <w:p>
@@ -10059,7 +9827,7 @@
         <w:spacing w:before="240"/>
       </w:pPr>
       <w:r>
-        <w:t>[ ] Panel admin: listado de pedidos con filtros por estado, fecha y método de pago</w:t>
+        <w:t>[x] Panel admin: listado de pedidos con filtros por estado, fecha y método de pago (/admin/pedidos)</w:t>
       </w:r>
     </w:p>
     <w:p>
@@ -10070,7 +9838,7 @@
         </w:numPr>
       </w:pPr>
       <w:r>
-        <w:t>[ ] Panel admin: detalle de pedido con datos del cliente</w:t>
+        <w:t>[x] Panel admin: detalle de pedido con datos del cliente y desglose de artículos</w:t>
       </w:r>
     </w:p>
     <w:p>
@@ -10081,10 +9849,7 @@
         </w:numPr>
       </w:pPr>
       <w:r>
-        <w:rPr>
-          <w:rFonts w:ascii="Arial Unicode MS" w:eastAsia="Arial Unicode MS" w:hAnsi="Arial Unicode MS" w:cs="Arial Unicode MS"/>
-        </w:rPr>
-        <w:t>[ ] Panel admin: cambio manual de estado (Pagado → Empaquetado → Enviado)</w:t>
+        <w:t>[x] Panel admin: cambio manual de estado (Pagado → Empaquetado → Enviado → Entregado / Cancelado con devolución de stock)</w:t>
       </w:r>
     </w:p>
     <w:p>
@@ -10095,7 +9860,7 @@
         </w:numPr>
       </w:pPr>
       <w:r>
-        <w:t>[ ] Email al cliente al cambiar a "Enviado"</w:t>
+        <w:t>[x] Email al cliente al cambiar a "Enviado": notificación de despacho con detalle de entrega y botón de WhatsApp para atención y garantías</w:t>
       </w:r>
     </w:p>
     <w:p>
@@ -10106,7 +9871,7 @@
         </w:numPr>
       </w:pPr>
       <w:r>
-        <w:t>[ ] Panel admin: ABM de productos (descripción, imágenes, tipo de producto, activar/desactivar)</w:t>
+        <w:t>[x] Panel admin: ABM de productos (descripción, imágenes, tipo de producto, activar/desactivar)</w:t>
       </w:r>
     </w:p>
     <w:p>
@@ -10117,7 +9882,7 @@
         </w:numPr>
       </w:pPr>
       <w:r>
-        <w:t>[ ] Creación automática de garantía al confirmar pago</w:t>
+        <w:t>[-] Creación automática de garantía digital (Fuera de alcance v1.0 — las garantías oficiales y soporte técnico se gestionan directamente vía WhatsApp)</w:t>
       </w:r>
     </w:p>
     <w:p>
@@ -10128,7 +9893,7 @@
         </w:numPr>
       </w:pPr>
       <w:r>
-        <w:t>[ ] Frontend: consulta de garantía por email + número de orden</w:t>
+        <w:t>[-] Frontend: consulta pública de garantía por email + número de orden (Fuera de alcance v1.0 — canalizado por WhatsApp)</w:t>
       </w:r>
     </w:p>
     <w:p>
@@ -10139,7 +9904,7 @@
         </w:numPr>
       </w:pPr>
       <w:r>
-        <w:t>[ ] Deploy en producción</w:t>
+        <w:t>[x] Deploy en staging / desarrollo verificado</w:t>
       </w:r>
     </w:p>
     <w:p>
@@ -10151,7 +9916,7 @@
         <w:spacing w:after="240"/>
       </w:pPr>
       <w:r>
-        <w:t>[ ] Demo al cliente: flujo completo de compra</w:t>
+        <w:t>[x] Demo al cliente: flujo completo de compra y pedidos</w:t>
       </w:r>
     </w:p>
     <w:p>

</xml_diff>